<commit_message>
feat(frontend): agregar frontend Angular 21 consumiendo el API Gateway
</commit_message>
<xml_diff>
--- a/entregables/Informe-SIGIP.docx
+++ b/entregables/Informe-SIGIP.docx
@@ -5645,16 +5645,16 @@
           <w:sz w:val="22"/>
           <w:szCs w:val="22"/>
         </w:rPr>
-        <w:t xml:space="preserve">Frontend:</w:t>
-      </w:r>
-      <w:r>
-        <w:rPr>
-          <w:rFonts w:ascii="Arial" w:hAnsi="Arial" w:cs="Arial"/>
-          <w:noProof/>
-          <w:sz w:val="22"/>
-          <w:szCs w:val="22"/>
-        </w:rPr>
-        <w:t xml:space="preserve"> la interfaz web en Angular consumirá los servicios a través del API Gateway, que ya tiene CORS configurado. En esta entrega las funcionalidades se demuestran con la colección Postman y el script de prueba de punta a punta incluidos en el repositorio.</w:t>
+        <w:t>Frontend:</w:t>
+      </w:r>
+      <w:r>
+        <w:rPr>
+          <w:rFonts w:ascii="Arial" w:hAnsi="Arial" w:cs="Arial"/>
+          <w:noProof/>
+          <w:sz w:val="22"/>
+          <w:szCs w:val="22"/>
+        </w:rPr>
+        <w:t xml:space="preserve"> aplicación web en Angular 21 que consume los servicios únicamente a través del API Gateway, enviando el token JWT en cada petición. Tiene una pantalla por módulo y adapta el menú al rol del usuario (cliente o administrador); se describe en la sección 6.9. Postman y el script de punta a punta se mantienen como pruebas del backend.</w:t>
       </w:r>
     </w:p>
     <w:p>
@@ -7225,7 +7225,7 @@
           <w:sz w:val="22"/>
           <w:szCs w:val="22"/>
         </w:rPr>
-        <w:t xml:space="preserve">La solución quedó organizada en once módulos Maven. La tabla resume cada componente, el puerto que usa en el entorno local y su responsabilidad.</w:t>
+        <w:t>La solución quedó organizada en once módulos Maven y una aplicación Angular. La tabla resume cada componente, el puerto que usa en el entorno local y su responsabilidad.</w:t>
       </w:r>
     </w:p>
     <w:tbl>
@@ -7371,6 +7371,56 @@
                 <w:sz w:val="20"/>
               </w:rPr>
               <w:t>Registro y descubrimiento de servicios (Eureka)</w:t>
+            </w:r>
+          </w:p>
+        </w:tc>
+      </w:tr>
+      <w:tr>
+        <w:tc>
+          <w:tcPr>
+            <w:tcW w:type="dxa" w:w="2381"/>
+          </w:tcPr>
+          <w:p>
+            <w:pPr>
+              <w:keepNext/>
+              <w:spacing w:before="40" w:after="40" w:line="240" w:lineRule="auto"/>
+              <w:jc w:val="left"/>
+            </w:pPr>
+            <w:r>
+              <w:rPr/>
+              <w:t>frontend</w:t>
+            </w:r>
+          </w:p>
+        </w:tc>
+        <w:tc>
+          <w:tcPr>
+            <w:tcW w:type="dxa" w:w="907"/>
+          </w:tcPr>
+          <w:p>
+            <w:pPr>
+              <w:keepNext/>
+              <w:spacing w:before="40" w:after="40" w:line="240" w:lineRule="auto"/>
+              <w:jc w:val="left"/>
+            </w:pPr>
+            <w:r>
+              <w:rPr/>
+              <w:t>4200</w:t>
+            </w:r>
+          </w:p>
+        </w:tc>
+        <w:tc>
+          <w:tcPr>
+            <w:tcW w:type="dxa" w:w="5783"/>
+          </w:tcPr>
+          <w:p>
+            <w:pPr>
+              <w:keepNext/>
+              <w:spacing w:before="40" w:after="40" w:line="240" w:lineRule="auto"/>
+              <w:jc w:val="left"/>
+            </w:pPr>
+            <w:r>
+              <w:rPr/>
+              <w:t>Interfaz web Angular servida con nginx; reenvía /api al gateway</w:t>
             </w:r>
           </w:p>
         </w:tc>
@@ -8194,7 +8244,37 @@
           <w:sz w:val="22"/>
           <w:szCs w:val="22"/>
         </w:rPr>
-        <w:t xml:space="preserve">Construcción en paralelo de las diez imágenes Docker de los servicios.</w:t>
+        <w:t>Pruebas unitarias (Vitest) y build de producción del frontend Angular.</w:t>
+      </w:r>
+    </w:p>
+    <w:p>
+      <w:pPr>
+        <w:numPr>
+          <w:ilvl w:val="0"/>
+          <w:numId w:val="19"/>
+        </w:numPr>
+        <w:tabs>
+          <w:tab w:val="clear" w:pos="720"/>
+          <w:tab w:val="num" w:pos="567"/>
+        </w:tabs>
+        <w:spacing w:before="120" w:line="23" w:lineRule="atLeast"/>
+        <w:ind w:left="1276"/>
+        <w:rPr>
+          <w:rFonts w:ascii="Arial" w:hAnsi="Arial" w:cs="Arial"/>
+          <w:noProof/>
+          <w:sz w:val="22"/>
+          <w:szCs w:val="22"/>
+          <w:lang w:val="es-PE"/>
+        </w:rPr>
+      </w:pPr>
+      <w:r>
+        <w:rPr>
+          <w:rFonts w:ascii="Arial" w:hAnsi="Arial" w:cs="Arial"/>
+          <w:noProof/>
+          <w:sz w:val="22"/>
+          <w:szCs w:val="22"/>
+        </w:rPr>
+        <w:t>Construcción en paralelo de las once imágenes Docker: los diez servicios y el frontend.</w:t>
       </w:r>
     </w:p>
     <w:p>
@@ -10138,16 +10218,62 @@
           </w:tcPr>
           <w:p>
             <w:pPr>
+              <w:keepNext/>
+              <w:spacing w:before="40" w:after="40" w:line="240" w:lineRule="auto"/>
+              <w:jc w:val="left"/>
+            </w:pPr>
+            <w:r>
+              <w:rPr/>
+              <w:t>frontend (Angular)</w:t>
+            </w:r>
+          </w:p>
+        </w:tc>
+        <w:tc>
+          <w:tcPr>
+            <w:tcW w:type="dxa" w:w="1134"/>
+          </w:tcPr>
+          <w:p>
+            <w:pPr>
+              <w:keepNext/>
+              <w:spacing w:before="40" w:after="40" w:line="240" w:lineRule="auto"/>
+              <w:jc w:val="left"/>
+            </w:pPr>
+            <w:r>
+              <w:rPr/>
+              <w:t>14</w:t>
+            </w:r>
+          </w:p>
+        </w:tc>
+        <w:tc>
+          <w:tcPr>
+            <w:tcW w:type="dxa" w:w="5669"/>
+          </w:tcPr>
+          <w:p>
+            <w:pPr>
+              <w:keepNext/>
+              <w:spacing w:before="40" w:after="40" w:line="240" w:lineRule="auto"/>
+              <w:jc w:val="left"/>
+            </w:pPr>
+            <w:r>
+              <w:rPr/>
+              <w:t>Sesión JWT, interceptor, guards por rol y mensajes de error</w:t>
+            </w:r>
+          </w:p>
+        </w:tc>
+      </w:tr>
+      <w:tr>
+        <w:tc>
+          <w:tcPr>
+            <w:tcW w:type="dxa" w:w="2268"/>
+          </w:tcPr>
+          <w:p>
+            <w:pPr>
               <w:keepNext w:val="0"/>
               <w:spacing w:before="40" w:after="40" w:line="240" w:lineRule="auto"/>
               <w:jc w:val="left"/>
             </w:pPr>
-            <w:r/>
             <w:r>
-              <w:rPr>
-                <w:rFonts w:ascii="Arial" w:hAnsi="Arial"/>
-                <w:sz w:val="20"/>
-              </w:rPr>
+              <w:rPr/>
               <w:t>Total</w:t>
             </w:r>
           </w:p>
@@ -10162,13 +10288,9 @@
               <w:spacing w:before="40" w:after="40" w:line="240" w:lineRule="auto"/>
               <w:jc w:val="left"/>
             </w:pPr>
-            <w:r/>
             <w:r>
-              <w:rPr>
-                <w:rFonts w:ascii="Arial" w:hAnsi="Arial"/>
-                <w:sz w:val="20"/>
-              </w:rPr>
-              <w:t>78</w:t>
+              <w:rPr/>
+              <w:t>92</w:t>
             </w:r>
           </w:p>
         </w:tc>
@@ -10182,18 +10304,655 @@
               <w:spacing w:before="40" w:after="40" w:line="240" w:lineRule="auto"/>
               <w:jc w:val="left"/>
             </w:pPr>
-            <w:r/>
             <w:r>
-              <w:rPr>
-                <w:rFonts w:ascii="Arial" w:hAnsi="Arial"/>
-                <w:sz w:val="20"/>
-              </w:rPr>
-              <w:t>Todas en verde con mvn clean verify</w:t>
+              <w:rPr/>
+              <w:t>78 del backend (mvn clean verify) y 14 del frontend (npm test)</w:t>
             </w:r>
           </w:p>
         </w:tc>
       </w:tr>
     </w:tbl>
+    <w:p>
+      <w:pPr>
+        <w:tabs>
+          <w:tab w:val="right" w:pos="8505"/>
+        </w:tabs>
+        <w:spacing w:after="0" w:line="240" w:lineRule="auto"/>
+        <w:jc w:val="left"/>
+        <w:rPr>
+          <w:rFonts w:ascii="Arial" w:hAnsi="Arial" w:cs="Arial"/>
+          <w:sz w:val="24"/>
+          <w:szCs w:val="24"/>
+        </w:rPr>
+      </w:pPr>
+    </w:p>
+    <w:p>
+      <w:pPr>
+        <w:pStyle w:val="Estilo2"/>
+        <w:spacing w:before="120" w:after="120" w:line="23" w:lineRule="atLeast"/>
+        <w:ind w:left="708"/>
+        <w:rPr>
+          <w:rFonts w:ascii="Arial" w:hAnsi="Arial" w:cs="Arial"/>
+          <w:b/>
+          <w:sz w:val="22"/>
+          <w:szCs w:val="22"/>
+        </w:rPr>
+      </w:pPr>
+      <w:bookmarkStart w:id="9023" w:name="_TocSIGIP023"/>
+      <w:bookmarkEnd w:id="9023"/>
+      <w:r>
+        <w:rPr>
+          <w:rFonts w:ascii="Arial" w:hAnsi="Arial" w:cs="Arial"/>
+          <w:b/>
+          <w:noProof/>
+          <w:sz w:val="22"/>
+          <w:szCs w:val="22"/>
+        </w:rPr>
+        <w:t>6.9- Frontend Angular</w:t>
+      </w:r>
+    </w:p>
+    <w:p>
+      <w:pPr>
+        <w:spacing w:before="120" w:line="23" w:lineRule="atLeast"/>
+        <w:ind w:left="709"/>
+        <w:rPr>
+          <w:rFonts w:ascii="Arial" w:hAnsi="Arial" w:cs="Arial"/>
+          <w:noProof/>
+          <w:sz w:val="22"/>
+          <w:szCs w:val="22"/>
+          <w:lang w:val="es-PE"/>
+        </w:rPr>
+      </w:pPr>
+      <w:r>
+        <w:rPr>
+          <w:rFonts w:ascii="Arial" w:hAnsi="Arial" w:cs="Arial"/>
+          <w:noProof/>
+          <w:sz w:val="22"/>
+          <w:szCs w:val="22"/>
+          <w:lang w:val="es-PE"/>
+        </w:rPr>
+        <w:t xml:space="preserve">La interfaz web se desarrolló con Angular 21 usando componentes standalone, signals para el estado de cada pantalla y carga diferida (lazy loading) de rutas. Se organiza en tres capas: </w:t>
+      </w:r>
+      <w:r>
+        <w:rPr>
+          <w:rFonts w:ascii="Arial" w:hAnsi="Arial" w:cs="Arial"/>
+          <w:b/>
+          <w:noProof/>
+          <w:sz w:val="22"/>
+          <w:szCs w:val="22"/>
+          <w:lang w:val="es-PE"/>
+        </w:rPr>
+        <w:t>core</w:t>
+      </w:r>
+      <w:r>
+        <w:rPr>
+          <w:rFonts w:ascii="Arial" w:hAnsi="Arial" w:cs="Arial"/>
+          <w:noProof/>
+          <w:sz w:val="22"/>
+          <w:szCs w:val="22"/>
+          <w:lang w:val="es-PE"/>
+        </w:rPr>
+        <w:t xml:space="preserve"> (modelos, sesión, interceptor, guards y un servicio por microservicio), </w:t>
+      </w:r>
+      <w:r>
+        <w:rPr>
+          <w:rFonts w:ascii="Arial" w:hAnsi="Arial" w:cs="Arial"/>
+          <w:b/>
+          <w:noProof/>
+          <w:sz w:val="22"/>
+          <w:szCs w:val="22"/>
+          <w:lang w:val="es-PE"/>
+        </w:rPr>
+        <w:t>shared</w:t>
+      </w:r>
+      <w:r>
+        <w:rPr>
+          <w:rFonts w:ascii="Arial" w:hAnsi="Arial" w:cs="Arial"/>
+          <w:noProof/>
+          <w:sz w:val="22"/>
+          <w:szCs w:val="22"/>
+          <w:lang w:val="es-PE"/>
+        </w:rPr>
+        <w:t xml:space="preserve"> (modal, etiquetas de estado) y </w:t>
+      </w:r>
+      <w:r>
+        <w:rPr>
+          <w:rFonts w:ascii="Arial" w:hAnsi="Arial" w:cs="Arial"/>
+          <w:b/>
+          <w:noProof/>
+          <w:sz w:val="22"/>
+          <w:szCs w:val="22"/>
+          <w:lang w:val="es-PE"/>
+        </w:rPr>
+        <w:t>pages</w:t>
+      </w:r>
+      <w:r>
+        <w:rPr>
+          <w:rFonts w:ascii="Arial" w:hAnsi="Arial" w:cs="Arial"/>
+          <w:noProof/>
+          <w:sz w:val="22"/>
+          <w:szCs w:val="22"/>
+          <w:lang w:val="es-PE"/>
+        </w:rPr>
+        <w:t xml:space="preserve"> (una carpeta por pantalla).</w:t>
+      </w:r>
+    </w:p>
+    <w:p>
+      <w:pPr>
+        <w:spacing w:before="120" w:line="23" w:lineRule="atLeast"/>
+        <w:ind w:left="709"/>
+        <w:rPr>
+          <w:rFonts w:ascii="Arial" w:hAnsi="Arial" w:cs="Arial"/>
+          <w:noProof/>
+          <w:sz w:val="22"/>
+          <w:szCs w:val="22"/>
+          <w:lang w:val="es-PE"/>
+        </w:rPr>
+      </w:pPr>
+      <w:r>
+        <w:rPr>
+          <w:rFonts w:ascii="Arial" w:hAnsi="Arial" w:cs="Arial"/>
+          <w:b/>
+          <w:noProof/>
+          <w:sz w:val="22"/>
+          <w:szCs w:val="22"/>
+          <w:lang w:val="es-PE"/>
+        </w:rPr>
+        <w:t>Seguridad:</w:t>
+      </w:r>
+      <w:r>
+        <w:rPr>
+          <w:rFonts w:ascii="Arial" w:hAnsi="Arial" w:cs="Arial"/>
+          <w:noProof/>
+          <w:sz w:val="22"/>
+          <w:szCs w:val="22"/>
+          <w:lang w:val="es-PE"/>
+        </w:rPr>
+        <w:t xml:space="preserve"> el login llama a auth-service y guarda el JWT; un interceptor HTTP lo agrega en cada petición y cierra la sesión si el backend responde 401. Los guards ocultan las pantallas de administrador al cliente, pero la autorización real sigue en el backend con @PreAuthorize.</w:t>
+      </w:r>
+    </w:p>
+    <w:p>
+      <w:pPr>
+        <w:spacing w:before="120" w:line="23" w:lineRule="atLeast"/>
+        <w:ind w:left="709"/>
+        <w:rPr>
+          <w:rFonts w:ascii="Arial" w:hAnsi="Arial" w:cs="Arial"/>
+          <w:noProof/>
+          <w:sz w:val="22"/>
+          <w:szCs w:val="22"/>
+          <w:lang w:val="es-PE"/>
+        </w:rPr>
+      </w:pPr>
+      <w:r>
+        <w:rPr>
+          <w:rFonts w:ascii="Arial" w:hAnsi="Arial" w:cs="Arial"/>
+          <w:b/>
+          <w:noProof/>
+          <w:sz w:val="22"/>
+          <w:szCs w:val="22"/>
+          <w:lang w:val="es-PE"/>
+        </w:rPr>
+        <w:t>Conexión:</w:t>
+      </w:r>
+      <w:r>
+        <w:rPr>
+          <w:rFonts w:ascii="Arial" w:hAnsi="Arial" w:cs="Arial"/>
+          <w:noProof/>
+          <w:sz w:val="22"/>
+          <w:szCs w:val="22"/>
+          <w:lang w:val="es-PE"/>
+        </w:rPr>
+        <w:t xml:space="preserve"> en desarrollo (npm start) el navegador llama al gateway http://localhost:8090, que permite el origen http://localhost:4200 por CORS. En Docker y en la nube, nginx sirve la aplicación y reenvía /api al gateway, de modo que el navegador usa un solo origen.</w:t>
+      </w:r>
+    </w:p>
+    <w:tbl>
+      <w:tblPr>
+        <w:tblStyle w:val="Tablaconcuadrcula"/>
+        <w:tblW w:type="dxa" w:w="9072"/>
+        <w:jc w:val="center"/>
+        <w:tblLayout w:type="fixed"/>
+        <w:tblLook w:firstColumn="1" w:firstRow="1" w:lastColumn="0" w:lastRow="0" w:noHBand="0" w:noVBand="1" w:val="04A0"/>
+        <w:tblLayout w:type="fixed"/>
+      </w:tblPr>
+      <w:tblGrid>
+        <w:gridCol w:w="1701"/>
+        <w:gridCol w:w="7371"/>
+      </w:tblGrid>
+      <w:tr>
+        <w:trPr>
+          <w:tblHeader/>
+        </w:trPr>
+        <w:tc>
+          <w:tcPr>
+            <w:tcW w:type="dxa" w:w="1701"/>
+            <w:shd w:val="clear" w:fill="D9E2F3"/>
+          </w:tcPr>
+          <w:p>
+            <w:pPr>
+              <w:keepNext/>
+              <w:spacing w:before="40" w:after="40" w:line="240" w:lineRule="auto"/>
+              <w:jc w:val="left"/>
+            </w:pPr>
+            <w:r>
+              <w:rPr>
+                <w:b/>
+              </w:rPr>
+              <w:t>Pantalla</w:t>
+            </w:r>
+          </w:p>
+        </w:tc>
+        <w:tc>
+          <w:tcPr>
+            <w:tcW w:type="dxa" w:w="7370"/>
+            <w:shd w:val="clear" w:fill="D9E2F3"/>
+          </w:tcPr>
+          <w:p>
+            <w:pPr>
+              <w:keepNext/>
+              <w:spacing w:before="40" w:after="40" w:line="240" w:lineRule="auto"/>
+              <w:jc w:val="left"/>
+            </w:pPr>
+            <w:r>
+              <w:rPr>
+                <w:b/>
+              </w:rPr>
+              <w:t>Qué permite</w:t>
+            </w:r>
+          </w:p>
+        </w:tc>
+      </w:tr>
+      <w:tr>
+        <w:tc>
+          <w:tcPr>
+            <w:tcW w:type="dxa" w:w="1701"/>
+          </w:tcPr>
+          <w:p>
+            <w:pPr>
+              <w:keepNext/>
+              <w:spacing w:before="40" w:after="40" w:line="240" w:lineRule="auto"/>
+              <w:jc w:val="left"/>
+            </w:pPr>
+            <w:r>
+              <w:rPr/>
+              <w:t>Login y registro</w:t>
+            </w:r>
+          </w:p>
+        </w:tc>
+        <w:tc>
+          <w:tcPr>
+            <w:tcW w:type="dxa" w:w="7370"/>
+          </w:tcPr>
+          <w:p>
+            <w:pPr>
+              <w:keepNext/>
+              <w:spacing w:before="40" w:after="40" w:line="240" w:lineRule="auto"/>
+              <w:jc w:val="left"/>
+            </w:pPr>
+            <w:r>
+              <w:rPr/>
+              <w:t>Inicio de sesión con JWT y alta de clientes</w:t>
+            </w:r>
+          </w:p>
+        </w:tc>
+      </w:tr>
+      <w:tr>
+        <w:tc>
+          <w:tcPr>
+            <w:tcW w:type="dxa" w:w="1701"/>
+          </w:tcPr>
+          <w:p>
+            <w:pPr>
+              <w:keepNext/>
+              <w:spacing w:before="40" w:after="40" w:line="240" w:lineRule="auto"/>
+              <w:jc w:val="left"/>
+            </w:pPr>
+            <w:r>
+              <w:rPr/>
+              <w:t>Catálogo</w:t>
+            </w:r>
+          </w:p>
+        </w:tc>
+        <w:tc>
+          <w:tcPr>
+            <w:tcW w:type="dxa" w:w="7370"/>
+          </w:tcPr>
+          <w:p>
+            <w:pPr>
+              <w:keepNext/>
+              <w:spacing w:before="40" w:after="40" w:line="240" w:lineRule="auto"/>
+              <w:jc w:val="left"/>
+            </w:pPr>
+            <w:r>
+              <w:rPr/>
+              <w:t>Ver servicios activos por categoría y registrar un pedido</w:t>
+            </w:r>
+          </w:p>
+        </w:tc>
+      </w:tr>
+      <w:tr>
+        <w:tc>
+          <w:tcPr>
+            <w:tcW w:type="dxa" w:w="1701"/>
+          </w:tcPr>
+          <w:p>
+            <w:pPr>
+              <w:keepNext/>
+              <w:spacing w:before="40" w:after="40" w:line="240" w:lineRule="auto"/>
+              <w:jc w:val="left"/>
+            </w:pPr>
+            <w:r>
+              <w:rPr/>
+              <w:t>Pedidos y detalle</w:t>
+            </w:r>
+          </w:p>
+        </w:tc>
+        <w:tc>
+          <w:tcPr>
+            <w:tcW w:type="dxa" w:w="7370"/>
+          </w:tcPr>
+          <w:p>
+            <w:pPr>
+              <w:keepNext/>
+              <w:spacing w:before="40" w:after="40" w:line="240" w:lineRule="auto"/>
+              <w:jc w:val="left"/>
+            </w:pPr>
+            <w:r>
+              <w:rPr/>
+              <w:t>Avance del pedido, pagos, diseños; el admin verifica pagos y cambia estados</w:t>
+            </w:r>
+          </w:p>
+        </w:tc>
+      </w:tr>
+      <w:tr>
+        <w:tc>
+          <w:tcPr>
+            <w:tcW w:type="dxa" w:w="1701"/>
+          </w:tcPr>
+          <w:p>
+            <w:pPr>
+              <w:keepNext/>
+              <w:spacing w:before="40" w:after="40" w:line="240" w:lineRule="auto"/>
+              <w:jc w:val="left"/>
+            </w:pPr>
+            <w:r>
+              <w:rPr/>
+              <w:t>Diseños</w:t>
+            </w:r>
+          </w:p>
+        </w:tc>
+        <w:tc>
+          <w:tcPr>
+            <w:tcW w:type="dxa" w:w="7370"/>
+          </w:tcPr>
+          <w:p>
+            <w:pPr>
+              <w:keepNext/>
+              <w:spacing w:before="40" w:after="40" w:line="240" w:lineRule="auto"/>
+              <w:jc w:val="left"/>
+            </w:pPr>
+            <w:r>
+              <w:rPr/>
+              <w:t>El admin publica versiones; el cliente aprueba u observa</w:t>
+            </w:r>
+          </w:p>
+        </w:tc>
+      </w:tr>
+      <w:tr>
+        <w:tc>
+          <w:tcPr>
+            <w:tcW w:type="dxa" w:w="1701"/>
+          </w:tcPr>
+          <w:p>
+            <w:pPr>
+              <w:keepNext w:val="0"/>
+              <w:spacing w:before="40" w:after="40" w:line="240" w:lineRule="auto"/>
+              <w:jc w:val="left"/>
+            </w:pPr>
+            <w:r>
+              <w:rPr/>
+              <w:t>Producción (admin)</w:t>
+            </w:r>
+          </w:p>
+        </w:tc>
+        <w:tc>
+          <w:tcPr>
+            <w:tcW w:type="dxa" w:w="7370"/>
+          </w:tcPr>
+          <w:p>
+            <w:pPr>
+              <w:keepNext w:val="0"/>
+              <w:spacing w:before="40" w:after="40" w:line="240" w:lineRule="auto"/>
+              <w:jc w:val="left"/>
+            </w:pPr>
+            <w:r>
+              <w:rPr/>
+              <w:t>Cola por prioridad, inicio y control de calidad con reproceso</w:t>
+            </w:r>
+          </w:p>
+        </w:tc>
+      </w:tr>
+      <w:tr>
+        <w:tc>
+          <w:tcPr>
+            <w:tcW w:type="dxa" w:w="1701"/>
+          </w:tcPr>
+          <w:p>
+            <w:pPr>
+              <w:keepNext w:val="0"/>
+              <w:spacing w:before="40" w:after="40" w:line="240" w:lineRule="auto"/>
+              <w:jc w:val="left"/>
+            </w:pPr>
+            <w:r>
+              <w:rPr/>
+              <w:t>Inventario (admin)</w:t>
+            </w:r>
+          </w:p>
+        </w:tc>
+        <w:tc>
+          <w:tcPr>
+            <w:tcW w:type="dxa" w:w="7370"/>
+          </w:tcPr>
+          <w:p>
+            <w:pPr>
+              <w:keepNext w:val="0"/>
+              <w:spacing w:before="40" w:after="40" w:line="240" w:lineRule="auto"/>
+              <w:jc w:val="left"/>
+            </w:pPr>
+            <w:r>
+              <w:rPr/>
+              <w:t>Insumos, entradas y salidas, kárdex y alerta de stock mínimo</w:t>
+            </w:r>
+          </w:p>
+        </w:tc>
+      </w:tr>
+      <w:tr>
+        <w:tc>
+          <w:tcPr>
+            <w:tcW w:type="dxa" w:w="1701"/>
+          </w:tcPr>
+          <w:p>
+            <w:pPr>
+              <w:keepNext w:val="0"/>
+              <w:spacing w:before="40" w:after="40" w:line="240" w:lineRule="auto"/>
+              <w:jc w:val="left"/>
+            </w:pPr>
+            <w:r>
+              <w:rPr/>
+              <w:t>Notificaciones</w:t>
+            </w:r>
+          </w:p>
+        </w:tc>
+        <w:tc>
+          <w:tcPr>
+            <w:tcW w:type="dxa" w:w="7370"/>
+          </w:tcPr>
+          <w:p>
+            <w:pPr>
+              <w:keepNext w:val="0"/>
+              <w:spacing w:before="40" w:after="40" w:line="240" w:lineRule="auto"/>
+              <w:jc w:val="left"/>
+            </w:pPr>
+            <w:r>
+              <w:rPr/>
+              <w:t>Avisos generados por RabbitMQ y contador de no leídas</w:t>
+            </w:r>
+          </w:p>
+        </w:tc>
+      </w:tr>
+      <w:tr>
+        <w:tc>
+          <w:tcPr>
+            <w:tcW w:type="dxa" w:w="1701"/>
+          </w:tcPr>
+          <w:p>
+            <w:pPr>
+              <w:keepNext w:val="0"/>
+              <w:spacing w:before="40" w:after="40" w:line="240" w:lineRule="auto"/>
+              <w:jc w:val="left"/>
+            </w:pPr>
+            <w:r>
+              <w:rPr/>
+              <w:t>Dashboard (admin)</w:t>
+            </w:r>
+          </w:p>
+        </w:tc>
+        <w:tc>
+          <w:tcPr>
+            <w:tcW w:type="dxa" w:w="7370"/>
+          </w:tcPr>
+          <w:p>
+            <w:pPr>
+              <w:keepNext w:val="0"/>
+              <w:spacing w:before="40" w:after="40" w:line="240" w:lineRule="auto"/>
+              <w:jc w:val="left"/>
+            </w:pPr>
+            <w:r>
+              <w:rPr/>
+              <w:t>Ventas confirmadas, pedidos por estado e insumos críticos</w:t>
+            </w:r>
+          </w:p>
+        </w:tc>
+      </w:tr>
+      <w:tr>
+        <w:tc>
+          <w:tcPr>
+            <w:tcW w:type="dxa" w:w="1701"/>
+          </w:tcPr>
+          <w:p>
+            <w:pPr>
+              <w:keepNext w:val="0"/>
+              <w:spacing w:before="40" w:after="40" w:line="240" w:lineRule="auto"/>
+              <w:jc w:val="left"/>
+            </w:pPr>
+            <w:r>
+              <w:rPr/>
+              <w:t>Catálogo y usuarios (admin)</w:t>
+            </w:r>
+          </w:p>
+        </w:tc>
+        <w:tc>
+          <w:tcPr>
+            <w:tcW w:type="dxa" w:w="7370"/>
+          </w:tcPr>
+          <w:p>
+            <w:pPr>
+              <w:keepNext w:val="0"/>
+              <w:spacing w:before="40" w:after="40" w:line="240" w:lineRule="auto"/>
+              <w:jc w:val="left"/>
+            </w:pPr>
+            <w:r>
+              <w:rPr/>
+              <w:t>CRUD de categorías, servicios, usuarios y roles</w:t>
+            </w:r>
+          </w:p>
+        </w:tc>
+      </w:tr>
+    </w:tbl>
+    <w:p>
+      <w:pPr>
+        <w:spacing w:before="120" w:line="23" w:lineRule="atLeast"/>
+        <w:ind w:left="709"/>
+        <w:rPr>
+          <w:rFonts w:ascii="Arial" w:hAnsi="Arial" w:cs="Arial"/>
+          <w:noProof/>
+          <w:sz w:val="22"/>
+          <w:szCs w:val="22"/>
+          <w:lang w:val="es-PE"/>
+        </w:rPr>
+      </w:pPr>
+      <w:r>
+        <w:rPr>
+          <w:rFonts w:ascii="Arial" w:hAnsi="Arial" w:cs="Arial"/>
+          <w:noProof/>
+          <w:sz w:val="22"/>
+          <w:szCs w:val="22"/>
+          <w:lang w:val="es-PE"/>
+        </w:rPr>
+        <w:t>El flujo completo se probó en el navegador con Playwright, tanto en Docker como con npm start y sin errores en la consola: registro del cliente, pedido, pago, verificación, diseño observado y aprobado, producción, entrega, salida de inventario hasta el stock mínimo y seis notificaciones recibidas por el cliente.</w:t>
+      </w:r>
+    </w:p>
+    <w:p>
+      <w:pPr>
+        <w:jc w:val="center"/>
+      </w:pPr>
+      <w:r>
+        <w:drawing>
+          <wp:inline xmlns:a="http://schemas.openxmlformats.org/drawingml/2006/main" xmlns:pic="http://schemas.openxmlformats.org/drawingml/2006/picture">
+            <wp:extent cx="5486400" cy="3293447"/>
+            <wp:docPr id="75214844" name="Picture 75214844"/>
+            <wp:cNvGraphicFramePr>
+              <a:graphicFrameLocks noChangeAspect="1"/>
+            </wp:cNvGraphicFramePr>
+            <a:graphic>
+              <a:graphicData uri="http://schemas.openxmlformats.org/drawingml/2006/picture">
+                <pic:pic>
+                  <pic:nvPicPr>
+                    <pic:cNvPr id="0" name="10-pedido-entregado.png"/>
+                    <pic:cNvPicPr/>
+                  </pic:nvPicPr>
+                  <pic:blipFill>
+                    <a:blip r:embed="rId17"/>
+                    <a:stretch>
+                      <a:fillRect/>
+                    </a:stretch>
+                  </pic:blipFill>
+                  <pic:spPr>
+                    <a:xfrm>
+                      <a:off x="0" y="0"/>
+                      <a:ext cx="5486400" cy="3293447"/>
+                    </a:xfrm>
+                    <a:prstGeom prst="rect"/>
+                  </pic:spPr>
+                </pic:pic>
+              </a:graphicData>
+            </a:graphic>
+          </wp:inline>
+        </w:drawing>
+      </w:r>
+    </w:p>
+    <w:p>
+      <w:pPr>
+        <w:spacing w:before="120" w:line="23" w:lineRule="atLeast"/>
+        <w:ind w:left="709"/>
+        <w:rPr>
+          <w:rFonts w:ascii="Arial" w:hAnsi="Arial" w:cs="Arial"/>
+          <w:noProof/>
+          <w:sz w:val="22"/>
+          <w:szCs w:val="22"/>
+          <w:lang w:val="es-PE"/>
+        </w:rPr>
+      </w:pPr>
+      <w:r>
+        <w:rPr>
+          <w:rFonts w:ascii="Arial" w:hAnsi="Arial" w:cs="Arial"/>
+          <w:noProof/>
+          <w:sz w:val="22"/>
+          <w:szCs w:val="22"/>
+          <w:lang w:val="es-PE"/>
+        </w:rPr>
+        <w:t>Figura: detalle de un pedido entregado (vista del administrador).</w:t>
+      </w:r>
+    </w:p>
     <w:p>
       <w:pPr>
         <w:spacing w:before="120" w:line="23" w:lineRule="atLeast"/>
@@ -10261,16 +11020,16 @@
           <w:sz w:val="22"/>
           <w:szCs w:val="22"/>
         </w:rPr>
-        <w:t xml:space="preserve">Código fuente:</w:t>
-      </w:r>
-      <w:r>
-        <w:rPr>
-          <w:rFonts w:ascii="Arial" w:hAnsi="Arial" w:cs="Arial"/>
-          <w:noProof/>
-          <w:sz w:val="22"/>
-          <w:szCs w:val="22"/>
-        </w:rPr>
-        <w:t xml:space="preserve"> repositorio GitHub https://github.com/yankardev/SIGIP con los once módulos, documentación, Dockerfile, docker-compose.yml, render.yaml y el pipeline de GitHub Actions.</w:t>
+        <w:t>Código fuente:</w:t>
+      </w:r>
+      <w:r>
+        <w:rPr>
+          <w:rFonts w:ascii="Arial" w:hAnsi="Arial" w:cs="Arial"/>
+          <w:noProof/>
+          <w:sz w:val="22"/>
+          <w:szCs w:val="22"/>
+        </w:rPr>
+        <w:t xml:space="preserve"> repositorio GitHub https://github.com/yankardev/SIGIP con los once módulos, el frontend Angular, documentación, Dockerfile, docker-compose.yml, render.yaml y el pipeline de GitHub Actions.</w:t>
       </w:r>
     </w:p>
     <w:p>
@@ -10311,6 +11070,46 @@
           <w:szCs w:val="22"/>
         </w:rPr>
         <w:t xml:space="preserve"> servicios publicados en Render con PostgreSQL, accesibles a través del API Gateway (URL pública: https://sigip-gateway.onrender.com, completar con la URL final del despliegue).</w:t>
+      </w:r>
+    </w:p>
+    <w:p>
+      <w:pPr>
+        <w:numPr>
+          <w:ilvl w:val="0"/>
+          <w:numId w:val="19"/>
+        </w:numPr>
+        <w:tabs>
+          <w:tab w:val="clear" w:pos="720"/>
+          <w:tab w:val="num" w:pos="567"/>
+        </w:tabs>
+        <w:spacing w:before="120" w:line="23" w:lineRule="atLeast"/>
+        <w:ind w:left="1276"/>
+        <w:rPr>
+          <w:rFonts w:ascii="Arial" w:hAnsi="Arial" w:cs="Arial"/>
+          <w:noProof/>
+          <w:sz w:val="22"/>
+          <w:szCs w:val="22"/>
+          <w:lang w:val="es-PE"/>
+        </w:rPr>
+      </w:pPr>
+      <w:r>
+        <w:rPr>
+          <w:rFonts w:ascii="Arial" w:hAnsi="Arial" w:cs="Arial"/>
+          <w:b/>
+          <w:noProof/>
+          <w:sz w:val="22"/>
+          <w:szCs w:val="22"/>
+        </w:rPr>
+        <w:t>Aplicación web:</w:t>
+      </w:r>
+      <w:r>
+        <w:rPr>
+          <w:rFonts w:ascii="Arial" w:hAnsi="Arial" w:cs="Arial"/>
+          <w:noProof/>
+          <w:sz w:val="22"/>
+          <w:szCs w:val="22"/>
+        </w:rPr>
+        <w:t xml:space="preserve"> frontend Angular en http://localhost:4200 con docker compose (y en Render como sigip-frontend).</w:t>
       </w:r>
     </w:p>
     <w:p>
@@ -10650,13 +11449,9 @@
               <w:spacing w:before="40" w:after="40" w:line="240" w:lineRule="auto"/>
               <w:jc w:val="left"/>
             </w:pPr>
-            <w:r/>
             <w:r>
-              <w:rPr>
-                <w:rFonts w:ascii="Arial" w:hAnsi="Arial"/>
-                <w:sz w:val="20"/>
-              </w:rPr>
-              <w:t>Postman en la nube: login, catálogo, pedido, pago y verificación</w:t>
+              <w:rPr/>
+              <w:t>Frontend: el cliente se registra, pide y paga; el administrador verifica, publica el diseño y produce</w:t>
             </w:r>
           </w:p>
         </w:tc>
@@ -10692,13 +11487,9 @@
               <w:spacing w:before="40" w:after="40" w:line="240" w:lineRule="auto"/>
               <w:jc w:val="left"/>
             </w:pPr>
-            <w:r/>
             <w:r>
-              <w:rPr>
-                <w:rFonts w:ascii="Arial" w:hAnsi="Arial"/>
-                <w:sz w:val="20"/>
-              </w:rPr>
-              <w:t>Producción, control de calidad, notificaciones y dashboard</w:t>
+              <w:rPr/>
+              <w:t>Control de calidad, notificaciones del cliente, inventario y dashboard en el frontend; Postman como respaldo</w:t>
             </w:r>
           </w:p>
         </w:tc>
@@ -10877,33 +11668,6 @@
     </w:p>
     <w:p>
       <w:pPr>
-        <w:pStyle w:val="Estilo1"/>
-        <w:spacing w:before="120" w:after="120" w:line="23" w:lineRule="atLeast"/>
-        <w:ind w:left="780"/>
-        <w:rPr>
-          <w:rFonts w:ascii="Arial" w:hAnsi="Arial" w:cs="Arial"/>
-          <w:b/>
-          <w:bCs/>
-          <w:color w:val="auto"/>
-          <w:sz w:val="22"/>
-          <w:szCs w:val="22"/>
-        </w:rPr>
-      </w:pPr>
-      <w:bookmarkStart w:id="9026" w:name="_TocSIGIP026"/>
-      <w:r>
-        <w:rPr>
-          <w:rFonts w:ascii="Arial" w:hAnsi="Arial" w:cs="Arial"/>
-          <w:b/>
-          <w:noProof/>
-          <w:sz w:val="22"/>
-          <w:szCs w:val="22"/>
-        </w:rPr>
-        <w:t xml:space="preserve">9.- Recomendaciones</w:t>
-      </w:r>
-      <w:bookmarkEnd w:id="9026"/>
-    </w:p>
-    <w:p>
-      <w:pPr>
         <w:numPr>
           <w:ilvl w:val="0"/>
           <w:numId w:val="19"/>
@@ -10929,8 +11693,35 @@
           <w:sz w:val="22"/>
           <w:szCs w:val="22"/>
         </w:rPr>
-        <w:t xml:space="preserve">Desarrollar la interfaz web en Angular sobre el API Gateway e incorporar pruebas de interfaz al pipeline, para que clientes y personal usen el sistema sin herramientas técnicas como Postman.</w:t>
-      </w:r>
+        <w:t>El frontend Angular permite que clientes y personal usen el sistema sin herramientas técnicas. Al consumir todo por el API Gateway y reutilizar el formato único de errores, no fue necesario cambiar el backend: la separación por capas y el contrato REST se mantuvieron.</w:t>
+      </w:r>
+    </w:p>
+    <w:p>
+      <w:pPr>
+        <w:pStyle w:val="Estilo1"/>
+        <w:spacing w:before="120" w:after="120" w:line="23" w:lineRule="atLeast"/>
+        <w:ind w:left="780"/>
+        <w:rPr>
+          <w:rFonts w:ascii="Arial" w:hAnsi="Arial" w:cs="Arial"/>
+          <w:b/>
+          <w:bCs/>
+          <w:color w:val="auto"/>
+          <w:sz w:val="22"/>
+          <w:szCs w:val="22"/>
+        </w:rPr>
+      </w:pPr>
+      <w:bookmarkStart w:id="9026" w:name="_TocSIGIP026"/>
+      <w:r>
+        <w:rPr>
+          <w:rFonts w:ascii="Arial" w:hAnsi="Arial" w:cs="Arial"/>
+          <w:b/>
+          <w:noProof/>
+          <w:sz w:val="22"/>
+          <w:szCs w:val="22"/>
+        </w:rPr>
+        <w:t xml:space="preserve">9.- Recomendaciones</w:t>
+      </w:r>
+      <w:bookmarkEnd w:id="9026"/>
     </w:p>
     <w:p>
       <w:pPr>
@@ -10959,7 +11750,7 @@
           <w:sz w:val="22"/>
           <w:szCs w:val="22"/>
         </w:rPr>
-        <w:t xml:space="preserve">Antes de usar SIGIP en producción, contratar un plan sin suspensión por inactividad, usar RabbitMQ administrado (por ejemplo CloudAMQP), guardar los secretos en un gestor de secretos y aplicar el patrón outbox para no perder eventos si el broker no está disponible.</w:t>
+        <w:t>Agregar al pipeline las pruebas de punta a punta de la interfaz (Playwright) y permitir subir los archivos de diseño desde el navegador a un almacenamiento en la nube.</w:t>
       </w:r>
     </w:p>
     <w:p>
@@ -10989,35 +11780,8 @@
           <w:sz w:val="22"/>
           <w:szCs w:val="22"/>
         </w:rPr>
-        <w:t xml:space="preserve">Monitorear el sistema con Prometheus y Grafana usando las métricas que ya exponen los servicios, y repetir la prueba de carga en cada versión para detectar degradaciones de rendimiento a tiempo.</w:t>
-      </w:r>
-    </w:p>
-    <w:p>
-      <w:pPr>
-        <w:pStyle w:val="Estilo1"/>
-        <w:spacing w:before="120" w:after="120" w:line="23" w:lineRule="atLeast"/>
-        <w:ind w:left="780"/>
-        <w:rPr>
-          <w:rFonts w:ascii="Arial" w:hAnsi="Arial" w:cs="Arial"/>
-          <w:b/>
-          <w:bCs/>
-          <w:color w:val="auto"/>
-          <w:sz w:val="22"/>
-          <w:szCs w:val="22"/>
-        </w:rPr>
-      </w:pPr>
-      <w:bookmarkStart w:id="9027" w:name="_TocSIGIP027"/>
-      <w:r>
-        <w:rPr>
-          <w:rFonts w:ascii="Arial" w:hAnsi="Arial" w:cs="Arial"/>
-          <w:b/>
-          <w:noProof/>
-          <w:sz w:val="22"/>
-          <w:szCs w:val="22"/>
-        </w:rPr>
-        <w:t xml:space="preserve">10.- Glosario</w:t>
-      </w:r>
-      <w:bookmarkEnd w:id="9027"/>
+        <w:t xml:space="preserve">Antes de usar SIGIP en producción, contratar un plan sin suspensión por inactividad, usar RabbitMQ administrado (por ejemplo CloudAMQP), guardar los secretos en un gestor de secretos y aplicar el patrón outbox para no perder eventos si el broker no está disponible.</w:t>
+      </w:r>
     </w:p>
     <w:p>
       <w:pPr>
@@ -11042,22 +11806,39 @@
       <w:r>
         <w:rPr>
           <w:rFonts w:ascii="Arial" w:hAnsi="Arial" w:cs="Arial"/>
+          <w:noProof/>
+          <w:sz w:val="22"/>
+          <w:szCs w:val="22"/>
+        </w:rPr>
+        <w:t xml:space="preserve">Monitorear el sistema con Prometheus y Grafana usando las métricas que ya exponen los servicios, y repetir la prueba de carga en cada versión para detectar degradaciones de rendimiento a tiempo.</w:t>
+      </w:r>
+    </w:p>
+    <w:p>
+      <w:pPr>
+        <w:pStyle w:val="Estilo1"/>
+        <w:spacing w:before="120" w:after="120" w:line="23" w:lineRule="atLeast"/>
+        <w:ind w:left="780"/>
+        <w:rPr>
+          <w:rFonts w:ascii="Arial" w:hAnsi="Arial" w:cs="Arial"/>
           <w:b/>
-          <w:noProof/>
-          <w:sz w:val="22"/>
-          <w:szCs w:val="22"/>
-        </w:rPr>
-        <w:t xml:space="preserve">API Gateway:</w:t>
-      </w:r>
-      <w:r>
-        <w:rPr>
-          <w:rFonts w:ascii="Arial" w:hAnsi="Arial" w:cs="Arial"/>
-          <w:noProof/>
-          <w:sz w:val="22"/>
-          <w:szCs w:val="22"/>
-        </w:rPr>
-        <w:t xml:space="preserve"> componente que recibe todas las peticiones y las dirige al microservicio que corresponde.</w:t>
-      </w:r>
+          <w:bCs/>
+          <w:color w:val="auto"/>
+          <w:sz w:val="22"/>
+          <w:szCs w:val="22"/>
+        </w:rPr>
+      </w:pPr>
+      <w:bookmarkStart w:id="9027" w:name="_TocSIGIP027"/>
+      <w:r>
+        <w:rPr>
+          <w:rFonts w:ascii="Arial" w:hAnsi="Arial" w:cs="Arial"/>
+          <w:b/>
+          <w:noProof/>
+          <w:sz w:val="22"/>
+          <w:szCs w:val="22"/>
+        </w:rPr>
+        <w:t xml:space="preserve">10.- Glosario</w:t>
+      </w:r>
+      <w:bookmarkEnd w:id="9027"/>
     </w:p>
     <w:p>
       <w:pPr>
@@ -11087,16 +11868,16 @@
           <w:sz w:val="22"/>
           <w:szCs w:val="22"/>
         </w:rPr>
-        <w:t xml:space="preserve">API REST:</w:t>
-      </w:r>
-      <w:r>
-        <w:rPr>
-          <w:rFonts w:ascii="Arial" w:hAnsi="Arial" w:cs="Arial"/>
-          <w:noProof/>
-          <w:sz w:val="22"/>
-          <w:szCs w:val="22"/>
-        </w:rPr>
-        <w:t xml:space="preserve"> interfaz que expone recursos mediante HTTP con los métodos GET, POST, PUT y DELETE.</w:t>
+        <w:t>Angular:</w:t>
+      </w:r>
+      <w:r>
+        <w:rPr>
+          <w:rFonts w:ascii="Arial" w:hAnsi="Arial" w:cs="Arial"/>
+          <w:noProof/>
+          <w:sz w:val="22"/>
+          <w:szCs w:val="22"/>
+        </w:rPr>
+        <w:t xml:space="preserve"> framework de Google para construir aplicaciones web de una sola página con TypeScript.</w:t>
       </w:r>
     </w:p>
     <w:p>
@@ -11127,16 +11908,16 @@
           <w:sz w:val="22"/>
           <w:szCs w:val="22"/>
         </w:rPr>
-        <w:t xml:space="preserve">BCrypt:</w:t>
-      </w:r>
-      <w:r>
-        <w:rPr>
-          <w:rFonts w:ascii="Arial" w:hAnsi="Arial" w:cs="Arial"/>
-          <w:noProof/>
-          <w:sz w:val="22"/>
-          <w:szCs w:val="22"/>
-        </w:rPr>
-        <w:t xml:space="preserve"> algoritmo de cifrado de contraseñas de un solo sentido que incluye una sal aleatoria.</w:t>
+        <w:t xml:space="preserve">API Gateway:</w:t>
+      </w:r>
+      <w:r>
+        <w:rPr>
+          <w:rFonts w:ascii="Arial" w:hAnsi="Arial" w:cs="Arial"/>
+          <w:noProof/>
+          <w:sz w:val="22"/>
+          <w:szCs w:val="22"/>
+        </w:rPr>
+        <w:t xml:space="preserve"> componente que recibe todas las peticiones y las dirige al microservicio que corresponde.</w:t>
       </w:r>
     </w:p>
     <w:p>
@@ -11167,16 +11948,16 @@
           <w:sz w:val="22"/>
           <w:szCs w:val="22"/>
         </w:rPr>
-        <w:t xml:space="preserve">Caché:</w:t>
-      </w:r>
-      <w:r>
-        <w:rPr>
-          <w:rFonts w:ascii="Arial" w:hAnsi="Arial" w:cs="Arial"/>
-          <w:noProof/>
-          <w:sz w:val="22"/>
-          <w:szCs w:val="22"/>
-        </w:rPr>
-        <w:t xml:space="preserve"> almacenamiento temporal en memoria de datos consultados con frecuencia para responder más rápido.</w:t>
+        <w:t xml:space="preserve">API REST:</w:t>
+      </w:r>
+      <w:r>
+        <w:rPr>
+          <w:rFonts w:ascii="Arial" w:hAnsi="Arial" w:cs="Arial"/>
+          <w:noProof/>
+          <w:sz w:val="22"/>
+          <w:szCs w:val="22"/>
+        </w:rPr>
+        <w:t xml:space="preserve"> interfaz que expone recursos mediante HTTP con los métodos GET, POST, PUT y DELETE.</w:t>
       </w:r>
     </w:p>
     <w:p>
@@ -11207,16 +11988,16 @@
           <w:sz w:val="22"/>
           <w:szCs w:val="22"/>
         </w:rPr>
-        <w:t xml:space="preserve">CI/CD:</w:t>
-      </w:r>
-      <w:r>
-        <w:rPr>
-          <w:rFonts w:ascii="Arial" w:hAnsi="Arial" w:cs="Arial"/>
-          <w:noProof/>
-          <w:sz w:val="22"/>
-          <w:szCs w:val="22"/>
-        </w:rPr>
-        <w:t xml:space="preserve"> integración y entrega continuas: compilar, probar y publicar el software de forma automática.</w:t>
+        <w:t xml:space="preserve">BCrypt:</w:t>
+      </w:r>
+      <w:r>
+        <w:rPr>
+          <w:rFonts w:ascii="Arial" w:hAnsi="Arial" w:cs="Arial"/>
+          <w:noProof/>
+          <w:sz w:val="22"/>
+          <w:szCs w:val="22"/>
+        </w:rPr>
+        <w:t xml:space="preserve"> algoritmo de cifrado de contraseñas de un solo sentido que incluye una sal aleatoria.</w:t>
       </w:r>
     </w:p>
     <w:p>
@@ -11247,16 +12028,16 @@
           <w:sz w:val="22"/>
           <w:szCs w:val="22"/>
         </w:rPr>
-        <w:t xml:space="preserve">Circuit breaker:</w:t>
-      </w:r>
-      <w:r>
-        <w:rPr>
-          <w:rFonts w:ascii="Arial" w:hAnsi="Arial" w:cs="Arial"/>
-          <w:noProof/>
-          <w:sz w:val="22"/>
-          <w:szCs w:val="22"/>
-        </w:rPr>
-        <w:t xml:space="preserve"> patrón que corta temporalmente las llamadas a un servicio que falla para proteger al resto.</w:t>
+        <w:t xml:space="preserve">Caché:</w:t>
+      </w:r>
+      <w:r>
+        <w:rPr>
+          <w:rFonts w:ascii="Arial" w:hAnsi="Arial" w:cs="Arial"/>
+          <w:noProof/>
+          <w:sz w:val="22"/>
+          <w:szCs w:val="22"/>
+        </w:rPr>
+        <w:t xml:space="preserve"> almacenamiento temporal en memoria de datos consultados con frecuencia para responder más rápido.</w:t>
       </w:r>
     </w:p>
     <w:p>
@@ -11287,16 +12068,16 @@
           <w:sz w:val="22"/>
           <w:szCs w:val="22"/>
         </w:rPr>
-        <w:t xml:space="preserve">Docker:</w:t>
-      </w:r>
-      <w:r>
-        <w:rPr>
-          <w:rFonts w:ascii="Arial" w:hAnsi="Arial" w:cs="Arial"/>
-          <w:noProof/>
-          <w:sz w:val="22"/>
-          <w:szCs w:val="22"/>
-        </w:rPr>
-        <w:t xml:space="preserve"> herramienta que empaqueta una aplicación y sus dependencias en una imagen portable (contenedor).</w:t>
+        <w:t xml:space="preserve">CI/CD:</w:t>
+      </w:r>
+      <w:r>
+        <w:rPr>
+          <w:rFonts w:ascii="Arial" w:hAnsi="Arial" w:cs="Arial"/>
+          <w:noProof/>
+          <w:sz w:val="22"/>
+          <w:szCs w:val="22"/>
+        </w:rPr>
+        <w:t xml:space="preserve"> integración y entrega continuas: compilar, probar y publicar el software de forma automática.</w:t>
       </w:r>
     </w:p>
     <w:p>
@@ -11327,16 +12108,16 @@
           <w:sz w:val="22"/>
           <w:szCs w:val="22"/>
         </w:rPr>
-        <w:t xml:space="preserve">DLQ:</w:t>
-      </w:r>
-      <w:r>
-        <w:rPr>
-          <w:rFonts w:ascii="Arial" w:hAnsi="Arial" w:cs="Arial"/>
-          <w:noProof/>
-          <w:sz w:val="22"/>
-          <w:szCs w:val="22"/>
-        </w:rPr>
-        <w:t xml:space="preserve"> cola de mensajes fallidos donde quedan los eventos que no se pudieron procesar tras los reintentos.</w:t>
+        <w:t xml:space="preserve">Circuit breaker:</w:t>
+      </w:r>
+      <w:r>
+        <w:rPr>
+          <w:rFonts w:ascii="Arial" w:hAnsi="Arial" w:cs="Arial"/>
+          <w:noProof/>
+          <w:sz w:val="22"/>
+          <w:szCs w:val="22"/>
+        </w:rPr>
+        <w:t xml:space="preserve"> patrón que corta temporalmente las llamadas a un servicio que falla para proteger al resto.</w:t>
       </w:r>
     </w:p>
     <w:p>
@@ -11367,16 +12148,16 @@
           <w:sz w:val="22"/>
           <w:szCs w:val="22"/>
         </w:rPr>
-        <w:t xml:space="preserve">Eureka:</w:t>
-      </w:r>
-      <w:r>
-        <w:rPr>
-          <w:rFonts w:ascii="Arial" w:hAnsi="Arial" w:cs="Arial"/>
-          <w:noProof/>
-          <w:sz w:val="22"/>
-          <w:szCs w:val="22"/>
-        </w:rPr>
-        <w:t xml:space="preserve"> servidor de registro donde los microservicios se inscriben y se ubican entre sí.</w:t>
+        <w:t>CORS:</w:t>
+      </w:r>
+      <w:r>
+        <w:rPr>
+          <w:rFonts w:ascii="Arial" w:hAnsi="Arial" w:cs="Arial"/>
+          <w:noProof/>
+          <w:sz w:val="22"/>
+          <w:szCs w:val="22"/>
+        </w:rPr>
+        <w:t xml:space="preserve"> regla del navegador que exige que el servidor autorice a otro dominio (por ejemplo, localhost:4200) a llamar su API.</w:t>
       </w:r>
     </w:p>
     <w:p>
@@ -11407,16 +12188,16 @@
           <w:sz w:val="22"/>
           <w:szCs w:val="22"/>
         </w:rPr>
-        <w:t xml:space="preserve">Idempotencia:</w:t>
-      </w:r>
-      <w:r>
-        <w:rPr>
-          <w:rFonts w:ascii="Arial" w:hAnsi="Arial" w:cs="Arial"/>
-          <w:noProof/>
-          <w:sz w:val="22"/>
-          <w:szCs w:val="22"/>
-        </w:rPr>
-        <w:t xml:space="preserve"> propiedad de una operación que produce el mismo resultado aunque se ejecute varias veces.</w:t>
+        <w:t xml:space="preserve">Docker:</w:t>
+      </w:r>
+      <w:r>
+        <w:rPr>
+          <w:rFonts w:ascii="Arial" w:hAnsi="Arial" w:cs="Arial"/>
+          <w:noProof/>
+          <w:sz w:val="22"/>
+          <w:szCs w:val="22"/>
+        </w:rPr>
+        <w:t xml:space="preserve"> herramienta que empaqueta una aplicación y sus dependencias en una imagen portable (contenedor).</w:t>
       </w:r>
     </w:p>
     <w:p>
@@ -11447,16 +12228,16 @@
           <w:sz w:val="22"/>
           <w:szCs w:val="22"/>
         </w:rPr>
-        <w:t xml:space="preserve">JWT:</w:t>
-      </w:r>
-      <w:r>
-        <w:rPr>
-          <w:rFonts w:ascii="Arial" w:hAnsi="Arial" w:cs="Arial"/>
-          <w:noProof/>
-          <w:sz w:val="22"/>
-          <w:szCs w:val="22"/>
-        </w:rPr>
-        <w:t xml:space="preserve"> token firmado que identifica al usuario y sus roles en cada petición sin guardar sesión en el servidor.</w:t>
+        <w:t xml:space="preserve">DLQ:</w:t>
+      </w:r>
+      <w:r>
+        <w:rPr>
+          <w:rFonts w:ascii="Arial" w:hAnsi="Arial" w:cs="Arial"/>
+          <w:noProof/>
+          <w:sz w:val="22"/>
+          <w:szCs w:val="22"/>
+        </w:rPr>
+        <w:t xml:space="preserve"> cola de mensajes fallidos donde quedan los eventos que no se pudieron procesar tras los reintentos.</w:t>
       </w:r>
     </w:p>
     <w:p>
@@ -11487,16 +12268,16 @@
           <w:sz w:val="22"/>
           <w:szCs w:val="22"/>
         </w:rPr>
-        <w:t xml:space="preserve">Latencia p95:</w:t>
-      </w:r>
-      <w:r>
-        <w:rPr>
-          <w:rFonts w:ascii="Arial" w:hAnsi="Arial" w:cs="Arial"/>
-          <w:noProof/>
-          <w:sz w:val="22"/>
-          <w:szCs w:val="22"/>
-        </w:rPr>
-        <w:t xml:space="preserve"> tiempo de respuesta que no supera el 95 % de las peticiones.</w:t>
+        <w:t xml:space="preserve">Eureka:</w:t>
+      </w:r>
+      <w:r>
+        <w:rPr>
+          <w:rFonts w:ascii="Arial" w:hAnsi="Arial" w:cs="Arial"/>
+          <w:noProof/>
+          <w:sz w:val="22"/>
+          <w:szCs w:val="22"/>
+        </w:rPr>
+        <w:t xml:space="preserve"> servidor de registro donde los microservicios se inscriben y se ubican entre sí.</w:t>
       </w:r>
     </w:p>
     <w:p>
@@ -11527,16 +12308,16 @@
           <w:sz w:val="22"/>
           <w:szCs w:val="22"/>
         </w:rPr>
-        <w:t xml:space="preserve">Maven:</w:t>
-      </w:r>
-      <w:r>
-        <w:rPr>
-          <w:rFonts w:ascii="Arial" w:hAnsi="Arial" w:cs="Arial"/>
-          <w:noProof/>
-          <w:sz w:val="22"/>
-          <w:szCs w:val="22"/>
-        </w:rPr>
-        <w:t xml:space="preserve"> herramienta que gestiona dependencias y automatiza la compilación y las pruebas de proyectos Java.</w:t>
+        <w:t xml:space="preserve">Idempotencia:</w:t>
+      </w:r>
+      <w:r>
+        <w:rPr>
+          <w:rFonts w:ascii="Arial" w:hAnsi="Arial" w:cs="Arial"/>
+          <w:noProof/>
+          <w:sz w:val="22"/>
+          <w:szCs w:val="22"/>
+        </w:rPr>
+        <w:t xml:space="preserve"> propiedad de una operación que produce el mismo resultado aunque se ejecute varias veces.</w:t>
       </w:r>
     </w:p>
     <w:p>
@@ -11567,16 +12348,16 @@
           <w:sz w:val="22"/>
           <w:szCs w:val="22"/>
         </w:rPr>
-        <w:t xml:space="preserve">Microservicio:</w:t>
-      </w:r>
-      <w:r>
-        <w:rPr>
-          <w:rFonts w:ascii="Arial" w:hAnsi="Arial" w:cs="Arial"/>
-          <w:noProof/>
-          <w:sz w:val="22"/>
-          <w:szCs w:val="22"/>
-        </w:rPr>
-        <w:t xml:space="preserve"> aplicación pequeña e independiente responsable de una parte del negocio, con su propia base de datos.</w:t>
+        <w:t>Interceptor:</w:t>
+      </w:r>
+      <w:r>
+        <w:rPr>
+          <w:rFonts w:ascii="Arial" w:hAnsi="Arial" w:cs="Arial"/>
+          <w:noProof/>
+          <w:sz w:val="22"/>
+          <w:szCs w:val="22"/>
+        </w:rPr>
+        <w:t xml:space="preserve"> pieza de Angular que procesa todas las peticiones HTTP; en SIGIP agrega el token JWT.</w:t>
       </w:r>
     </w:p>
     <w:p>
@@ -11607,16 +12388,16 @@
           <w:sz w:val="22"/>
           <w:szCs w:val="22"/>
         </w:rPr>
-        <w:t xml:space="preserve">N+1:</w:t>
-      </w:r>
-      <w:r>
-        <w:rPr>
-          <w:rFonts w:ascii="Arial" w:hAnsi="Arial" w:cs="Arial"/>
-          <w:noProof/>
-          <w:sz w:val="22"/>
-          <w:szCs w:val="22"/>
-        </w:rPr>
-        <w:t xml:space="preserve"> problema de rendimiento en el que se ejecuta una consulta adicional por cada registro de una lista.</w:t>
+        <w:t xml:space="preserve">JWT:</w:t>
+      </w:r>
+      <w:r>
+        <w:rPr>
+          <w:rFonts w:ascii="Arial" w:hAnsi="Arial" w:cs="Arial"/>
+          <w:noProof/>
+          <w:sz w:val="22"/>
+          <w:szCs w:val="22"/>
+        </w:rPr>
+        <w:t xml:space="preserve"> token firmado que identifica al usuario y sus roles en cada petición sin guardar sesión en el servidor.</w:t>
       </w:r>
     </w:p>
     <w:p>
@@ -11647,16 +12428,16 @@
           <w:sz w:val="22"/>
           <w:szCs w:val="22"/>
         </w:rPr>
-        <w:t xml:space="preserve">Pipeline:</w:t>
-      </w:r>
-      <w:r>
-        <w:rPr>
-          <w:rFonts w:ascii="Arial" w:hAnsi="Arial" w:cs="Arial"/>
-          <w:noProof/>
-          <w:sz w:val="22"/>
-          <w:szCs w:val="22"/>
-        </w:rPr>
-        <w:t xml:space="preserve"> secuencia automatizada de pasos que se ejecuta ante cada cambio en el repositorio.</w:t>
+        <w:t xml:space="preserve">Latencia p95:</w:t>
+      </w:r>
+      <w:r>
+        <w:rPr>
+          <w:rFonts w:ascii="Arial" w:hAnsi="Arial" w:cs="Arial"/>
+          <w:noProof/>
+          <w:sz w:val="22"/>
+          <w:szCs w:val="22"/>
+        </w:rPr>
+        <w:t xml:space="preserve"> tiempo de respuesta que no supera el 95 % de las peticiones.</w:t>
       </w:r>
     </w:p>
     <w:p>
@@ -11687,6 +12468,166 @@
           <w:sz w:val="22"/>
           <w:szCs w:val="22"/>
         </w:rPr>
+        <w:t xml:space="preserve">Maven:</w:t>
+      </w:r>
+      <w:r>
+        <w:rPr>
+          <w:rFonts w:ascii="Arial" w:hAnsi="Arial" w:cs="Arial"/>
+          <w:noProof/>
+          <w:sz w:val="22"/>
+          <w:szCs w:val="22"/>
+        </w:rPr>
+        <w:t xml:space="preserve"> herramienta que gestiona dependencias y automatiza la compilación y las pruebas de proyectos Java.</w:t>
+      </w:r>
+    </w:p>
+    <w:p>
+      <w:pPr>
+        <w:numPr>
+          <w:ilvl w:val="0"/>
+          <w:numId w:val="19"/>
+        </w:numPr>
+        <w:tabs>
+          <w:tab w:val="clear" w:pos="720"/>
+          <w:tab w:val="num" w:pos="567"/>
+        </w:tabs>
+        <w:spacing w:before="120" w:line="23" w:lineRule="atLeast"/>
+        <w:ind w:left="1276"/>
+        <w:rPr>
+          <w:rFonts w:ascii="Arial" w:hAnsi="Arial" w:cs="Arial"/>
+          <w:noProof/>
+          <w:sz w:val="22"/>
+          <w:szCs w:val="22"/>
+          <w:lang w:val="es-PE"/>
+        </w:rPr>
+      </w:pPr>
+      <w:r>
+        <w:rPr>
+          <w:rFonts w:ascii="Arial" w:hAnsi="Arial" w:cs="Arial"/>
+          <w:b/>
+          <w:noProof/>
+          <w:sz w:val="22"/>
+          <w:szCs w:val="22"/>
+        </w:rPr>
+        <w:t xml:space="preserve">Microservicio:</w:t>
+      </w:r>
+      <w:r>
+        <w:rPr>
+          <w:rFonts w:ascii="Arial" w:hAnsi="Arial" w:cs="Arial"/>
+          <w:noProof/>
+          <w:sz w:val="22"/>
+          <w:szCs w:val="22"/>
+        </w:rPr>
+        <w:t xml:space="preserve"> aplicación pequeña e independiente responsable de una parte del negocio, con su propia base de datos.</w:t>
+      </w:r>
+    </w:p>
+    <w:p>
+      <w:pPr>
+        <w:numPr>
+          <w:ilvl w:val="0"/>
+          <w:numId w:val="19"/>
+        </w:numPr>
+        <w:tabs>
+          <w:tab w:val="clear" w:pos="720"/>
+          <w:tab w:val="num" w:pos="567"/>
+        </w:tabs>
+        <w:spacing w:before="120" w:line="23" w:lineRule="atLeast"/>
+        <w:ind w:left="1276"/>
+        <w:rPr>
+          <w:rFonts w:ascii="Arial" w:hAnsi="Arial" w:cs="Arial"/>
+          <w:noProof/>
+          <w:sz w:val="22"/>
+          <w:szCs w:val="22"/>
+          <w:lang w:val="es-PE"/>
+        </w:rPr>
+      </w:pPr>
+      <w:r>
+        <w:rPr>
+          <w:rFonts w:ascii="Arial" w:hAnsi="Arial" w:cs="Arial"/>
+          <w:b/>
+          <w:noProof/>
+          <w:sz w:val="22"/>
+          <w:szCs w:val="22"/>
+        </w:rPr>
+        <w:t xml:space="preserve">N+1:</w:t>
+      </w:r>
+      <w:r>
+        <w:rPr>
+          <w:rFonts w:ascii="Arial" w:hAnsi="Arial" w:cs="Arial"/>
+          <w:noProof/>
+          <w:sz w:val="22"/>
+          <w:szCs w:val="22"/>
+        </w:rPr>
+        <w:t xml:space="preserve"> problema de rendimiento en el que se ejecuta una consulta adicional por cada registro de una lista.</w:t>
+      </w:r>
+    </w:p>
+    <w:p>
+      <w:pPr>
+        <w:numPr>
+          <w:ilvl w:val="0"/>
+          <w:numId w:val="19"/>
+        </w:numPr>
+        <w:tabs>
+          <w:tab w:val="clear" w:pos="720"/>
+          <w:tab w:val="num" w:pos="567"/>
+        </w:tabs>
+        <w:spacing w:before="120" w:line="23" w:lineRule="atLeast"/>
+        <w:ind w:left="1276"/>
+        <w:rPr>
+          <w:rFonts w:ascii="Arial" w:hAnsi="Arial" w:cs="Arial"/>
+          <w:noProof/>
+          <w:sz w:val="22"/>
+          <w:szCs w:val="22"/>
+          <w:lang w:val="es-PE"/>
+        </w:rPr>
+      </w:pPr>
+      <w:r>
+        <w:rPr>
+          <w:rFonts w:ascii="Arial" w:hAnsi="Arial" w:cs="Arial"/>
+          <w:b/>
+          <w:noProof/>
+          <w:sz w:val="22"/>
+          <w:szCs w:val="22"/>
+        </w:rPr>
+        <w:t xml:space="preserve">Pipeline:</w:t>
+      </w:r>
+      <w:r>
+        <w:rPr>
+          <w:rFonts w:ascii="Arial" w:hAnsi="Arial" w:cs="Arial"/>
+          <w:noProof/>
+          <w:sz w:val="22"/>
+          <w:szCs w:val="22"/>
+        </w:rPr>
+        <w:t xml:space="preserve"> secuencia automatizada de pasos que se ejecuta ante cada cambio en el repositorio.</w:t>
+      </w:r>
+    </w:p>
+    <w:p>
+      <w:pPr>
+        <w:numPr>
+          <w:ilvl w:val="0"/>
+          <w:numId w:val="19"/>
+        </w:numPr>
+        <w:tabs>
+          <w:tab w:val="clear" w:pos="720"/>
+          <w:tab w:val="num" w:pos="567"/>
+        </w:tabs>
+        <w:spacing w:before="120" w:line="23" w:lineRule="atLeast"/>
+        <w:ind w:left="1276"/>
+        <w:rPr>
+          <w:rFonts w:ascii="Arial" w:hAnsi="Arial" w:cs="Arial"/>
+          <w:noProof/>
+          <w:sz w:val="22"/>
+          <w:szCs w:val="22"/>
+          <w:lang w:val="es-PE"/>
+        </w:rPr>
+      </w:pPr>
+      <w:r>
+        <w:rPr>
+          <w:rFonts w:ascii="Arial" w:hAnsi="Arial" w:cs="Arial"/>
+          <w:b/>
+          <w:noProof/>
+          <w:sz w:val="22"/>
+          <w:szCs w:val="22"/>
+        </w:rPr>
         <w:t xml:space="preserve">RabbitMQ:</w:t>
       </w:r>
       <w:r>
@@ -11697,6 +12638,46 @@
           <w:szCs w:val="22"/>
         </w:rPr>
         <w:t xml:space="preserve"> intermediario de mensajes que permite la comunicación asíncrona mediante eventos.</w:t>
+      </w:r>
+    </w:p>
+    <w:p>
+      <w:pPr>
+        <w:numPr>
+          <w:ilvl w:val="0"/>
+          <w:numId w:val="19"/>
+        </w:numPr>
+        <w:tabs>
+          <w:tab w:val="clear" w:pos="720"/>
+          <w:tab w:val="num" w:pos="567"/>
+        </w:tabs>
+        <w:spacing w:before="120" w:line="23" w:lineRule="atLeast"/>
+        <w:ind w:left="1276"/>
+        <w:rPr>
+          <w:rFonts w:ascii="Arial" w:hAnsi="Arial" w:cs="Arial"/>
+          <w:noProof/>
+          <w:sz w:val="22"/>
+          <w:szCs w:val="22"/>
+          <w:lang w:val="es-PE"/>
+        </w:rPr>
+      </w:pPr>
+      <w:r>
+        <w:rPr>
+          <w:rFonts w:ascii="Arial" w:hAnsi="Arial" w:cs="Arial"/>
+          <w:b/>
+          <w:noProof/>
+          <w:sz w:val="22"/>
+          <w:szCs w:val="22"/>
+        </w:rPr>
+        <w:t>SPA:</w:t>
+      </w:r>
+      <w:r>
+        <w:rPr>
+          <w:rFonts w:ascii="Arial" w:hAnsi="Arial" w:cs="Arial"/>
+          <w:noProof/>
+          <w:sz w:val="22"/>
+          <w:szCs w:val="22"/>
+        </w:rPr>
+        <w:t xml:space="preserve"> aplicación de una sola página: el navegador carga la aplicación una vez y cambia de pantalla sin recargar.</w:t>
       </w:r>
     </w:p>
     <w:p>
@@ -14107,6 +15088,465 @@
           <w:szCs w:val="22"/>
         </w:rPr>
         <w:t xml:space="preserve">Los diagramas de casos de uso, arquitectura, clases, secuencia, despliegue y flujo del negocio se entregan en el archivo editable de Draw.io incluido en la carpeta del proyecto.</w:t>
+      </w:r>
+    </w:p>
+    <w:p>
+      <w:pPr>
+        <w:pStyle w:val="Estilo2"/>
+        <w:spacing w:before="120" w:after="120" w:line="23" w:lineRule="atLeast"/>
+        <w:ind w:left="708"/>
+        <w:rPr>
+          <w:rFonts w:ascii="Arial" w:hAnsi="Arial" w:cs="Arial"/>
+          <w:b/>
+          <w:sz w:val="22"/>
+          <w:szCs w:val="22"/>
+        </w:rPr>
+      </w:pPr>
+      <w:bookmarkStart w:id="9034" w:name="_TocSIGIP034"/>
+      <w:bookmarkEnd w:id="9034"/>
+      <w:r>
+        <w:rPr>
+          <w:rFonts w:ascii="Arial" w:hAnsi="Arial" w:cs="Arial"/>
+          <w:b/>
+          <w:noProof/>
+          <w:sz w:val="22"/>
+          <w:szCs w:val="22"/>
+        </w:rPr>
+        <w:t>Anexo F: Capturas del frontend Angular</w:t>
+      </w:r>
+    </w:p>
+    <w:p>
+      <w:pPr>
+        <w:jc w:val="center"/>
+      </w:pPr>
+      <w:r>
+        <w:drawing>
+          <wp:inline xmlns:a="http://schemas.openxmlformats.org/drawingml/2006/main" xmlns:pic="http://schemas.openxmlformats.org/drawingml/2006/picture">
+            <wp:extent cx="5303520" cy="3183665"/>
+            <wp:docPr id="75214845" name="Picture 75214845"/>
+            <wp:cNvGraphicFramePr>
+              <a:graphicFrameLocks noChangeAspect="1"/>
+            </wp:cNvGraphicFramePr>
+            <a:graphic>
+              <a:graphicData uri="http://schemas.openxmlformats.org/drawingml/2006/picture">
+                <pic:pic>
+                  <pic:nvPicPr>
+                    <pic:cNvPr id="0" name="01-login.png"/>
+                    <pic:cNvPicPr/>
+                  </pic:nvPicPr>
+                  <pic:blipFill>
+                    <a:blip r:embed="rId18"/>
+                    <a:stretch>
+                      <a:fillRect/>
+                    </a:stretch>
+                  </pic:blipFill>
+                  <pic:spPr>
+                    <a:xfrm>
+                      <a:off x="0" y="0"/>
+                      <a:ext cx="5303520" cy="3183665"/>
+                    </a:xfrm>
+                    <a:prstGeom prst="rect"/>
+                  </pic:spPr>
+                </pic:pic>
+              </a:graphicData>
+            </a:graphic>
+          </wp:inline>
+        </w:drawing>
+      </w:r>
+    </w:p>
+    <w:p>
+      <w:pPr>
+        <w:spacing w:before="120" w:line="23" w:lineRule="atLeast"/>
+        <w:ind w:left="709"/>
+        <w:rPr>
+          <w:rFonts w:ascii="Arial" w:hAnsi="Arial" w:cs="Arial"/>
+          <w:noProof/>
+          <w:sz w:val="22"/>
+          <w:szCs w:val="22"/>
+          <w:lang w:val="es-PE"/>
+        </w:rPr>
+      </w:pPr>
+      <w:r>
+        <w:rPr>
+          <w:rFonts w:ascii="Arial" w:hAnsi="Arial" w:cs="Arial"/>
+          <w:noProof/>
+          <w:sz w:val="22"/>
+          <w:szCs w:val="22"/>
+          <w:lang w:val="es-PE"/>
+        </w:rPr>
+        <w:t>Figura: Inicio de sesión.</w:t>
+      </w:r>
+    </w:p>
+    <w:p>
+      <w:pPr>
+        <w:jc w:val="center"/>
+      </w:pPr>
+      <w:r>
+        <w:drawing>
+          <wp:inline xmlns:a="http://schemas.openxmlformats.org/drawingml/2006/main" xmlns:pic="http://schemas.openxmlformats.org/drawingml/2006/picture">
+            <wp:extent cx="5303520" cy="3183665"/>
+            <wp:docPr id="75214846" name="Picture 75214846"/>
+            <wp:cNvGraphicFramePr>
+              <a:graphicFrameLocks noChangeAspect="1"/>
+            </wp:cNvGraphicFramePr>
+            <a:graphic>
+              <a:graphicData uri="http://schemas.openxmlformats.org/drawingml/2006/picture">
+                <pic:pic>
+                  <pic:nvPicPr>
+                    <pic:cNvPr id="0" name="02-catalogo-cliente.png"/>
+                    <pic:cNvPicPr/>
+                  </pic:nvPicPr>
+                  <pic:blipFill>
+                    <a:blip r:embed="rId19"/>
+                    <a:stretch>
+                      <a:fillRect/>
+                    </a:stretch>
+                  </pic:blipFill>
+                  <pic:spPr>
+                    <a:xfrm>
+                      <a:off x="0" y="0"/>
+                      <a:ext cx="5303520" cy="3183665"/>
+                    </a:xfrm>
+                    <a:prstGeom prst="rect"/>
+                  </pic:spPr>
+                </pic:pic>
+              </a:graphicData>
+            </a:graphic>
+          </wp:inline>
+        </w:drawing>
+      </w:r>
+    </w:p>
+    <w:p>
+      <w:pPr>
+        <w:spacing w:before="120" w:line="23" w:lineRule="atLeast"/>
+        <w:ind w:left="709"/>
+        <w:rPr>
+          <w:rFonts w:ascii="Arial" w:hAnsi="Arial" w:cs="Arial"/>
+          <w:noProof/>
+          <w:sz w:val="22"/>
+          <w:szCs w:val="22"/>
+          <w:lang w:val="es-PE"/>
+        </w:rPr>
+      </w:pPr>
+      <w:r>
+        <w:rPr>
+          <w:rFonts w:ascii="Arial" w:hAnsi="Arial" w:cs="Arial"/>
+          <w:noProof/>
+          <w:sz w:val="22"/>
+          <w:szCs w:val="22"/>
+          <w:lang w:val="es-PE"/>
+        </w:rPr>
+        <w:t>Figura: Catálogo visto por el cliente.</w:t>
+      </w:r>
+    </w:p>
+    <w:p>
+      <w:pPr>
+        <w:jc w:val="center"/>
+      </w:pPr>
+      <w:r>
+        <w:drawing>
+          <wp:inline xmlns:a="http://schemas.openxmlformats.org/drawingml/2006/main" xmlns:pic="http://schemas.openxmlformats.org/drawingml/2006/picture">
+            <wp:extent cx="5303520" cy="3183665"/>
+            <wp:docPr id="75214847" name="Picture 75214847"/>
+            <wp:cNvGraphicFramePr>
+              <a:graphicFrameLocks noChangeAspect="1"/>
+            </wp:cNvGraphicFramePr>
+            <a:graphic>
+              <a:graphicData uri="http://schemas.openxmlformats.org/drawingml/2006/picture">
+                <pic:pic>
+                  <pic:nvPicPr>
+                    <pic:cNvPr id="0" name="05-dashboard.png"/>
+                    <pic:cNvPicPr/>
+                  </pic:nvPicPr>
+                  <pic:blipFill>
+                    <a:blip r:embed="rId20"/>
+                    <a:stretch>
+                      <a:fillRect/>
+                    </a:stretch>
+                  </pic:blipFill>
+                  <pic:spPr>
+                    <a:xfrm>
+                      <a:off x="0" y="0"/>
+                      <a:ext cx="5303520" cy="3183665"/>
+                    </a:xfrm>
+                    <a:prstGeom prst="rect"/>
+                  </pic:spPr>
+                </pic:pic>
+              </a:graphicData>
+            </a:graphic>
+          </wp:inline>
+        </w:drawing>
+      </w:r>
+    </w:p>
+    <w:p>
+      <w:pPr>
+        <w:spacing w:before="120" w:line="23" w:lineRule="atLeast"/>
+        <w:ind w:left="709"/>
+        <w:rPr>
+          <w:rFonts w:ascii="Arial" w:hAnsi="Arial" w:cs="Arial"/>
+          <w:noProof/>
+          <w:sz w:val="22"/>
+          <w:szCs w:val="22"/>
+          <w:lang w:val="es-PE"/>
+        </w:rPr>
+      </w:pPr>
+      <w:r>
+        <w:rPr>
+          <w:rFonts w:ascii="Arial" w:hAnsi="Arial" w:cs="Arial"/>
+          <w:noProof/>
+          <w:sz w:val="22"/>
+          <w:szCs w:val="22"/>
+          <w:lang w:val="es-PE"/>
+        </w:rPr>
+        <w:t>Figura: Dashboard del administrador.</w:t>
+      </w:r>
+    </w:p>
+    <w:p>
+      <w:pPr>
+        <w:jc w:val="center"/>
+      </w:pPr>
+      <w:r>
+        <w:drawing>
+          <wp:inline xmlns:a="http://schemas.openxmlformats.org/drawingml/2006/main" xmlns:pic="http://schemas.openxmlformats.org/drawingml/2006/picture">
+            <wp:extent cx="5303520" cy="3183665"/>
+            <wp:docPr id="75214848" name="Picture 75214848"/>
+            <wp:cNvGraphicFramePr>
+              <a:graphicFrameLocks noChangeAspect="1"/>
+            </wp:cNvGraphicFramePr>
+            <a:graphic>
+              <a:graphicData uri="http://schemas.openxmlformats.org/drawingml/2006/picture">
+                <pic:pic>
+                  <pic:nvPicPr>
+                    <pic:cNvPr id="0" name="08-disenos-cliente.png"/>
+                    <pic:cNvPicPr/>
+                  </pic:nvPicPr>
+                  <pic:blipFill>
+                    <a:blip r:embed="rId21"/>
+                    <a:stretch>
+                      <a:fillRect/>
+                    </a:stretch>
+                  </pic:blipFill>
+                  <pic:spPr>
+                    <a:xfrm>
+                      <a:off x="0" y="0"/>
+                      <a:ext cx="5303520" cy="3183665"/>
+                    </a:xfrm>
+                    <a:prstGeom prst="rect"/>
+                  </pic:spPr>
+                </pic:pic>
+              </a:graphicData>
+            </a:graphic>
+          </wp:inline>
+        </w:drawing>
+      </w:r>
+    </w:p>
+    <w:p>
+      <w:pPr>
+        <w:spacing w:before="120" w:line="23" w:lineRule="atLeast"/>
+        <w:ind w:left="709"/>
+        <w:rPr>
+          <w:rFonts w:ascii="Arial" w:hAnsi="Arial" w:cs="Arial"/>
+          <w:noProof/>
+          <w:sz w:val="22"/>
+          <w:szCs w:val="22"/>
+          <w:lang w:val="es-PE"/>
+        </w:rPr>
+      </w:pPr>
+      <w:r>
+        <w:rPr>
+          <w:rFonts w:ascii="Arial" w:hAnsi="Arial" w:cs="Arial"/>
+          <w:noProof/>
+          <w:sz w:val="22"/>
+          <w:szCs w:val="22"/>
+          <w:lang w:val="es-PE"/>
+        </w:rPr>
+        <w:t>Figura: El cliente aprueba u observa el diseño.</w:t>
+      </w:r>
+    </w:p>
+    <w:p>
+      <w:pPr>
+        <w:jc w:val="center"/>
+      </w:pPr>
+      <w:r>
+        <w:drawing>
+          <wp:inline xmlns:a="http://schemas.openxmlformats.org/drawingml/2006/main" xmlns:pic="http://schemas.openxmlformats.org/drawingml/2006/picture">
+            <wp:extent cx="5303520" cy="3183665"/>
+            <wp:docPr id="75214849" name="Picture 75214849"/>
+            <wp:cNvGraphicFramePr>
+              <a:graphicFrameLocks noChangeAspect="1"/>
+            </wp:cNvGraphicFramePr>
+            <a:graphic>
+              <a:graphicData uri="http://schemas.openxmlformats.org/drawingml/2006/picture">
+                <pic:pic>
+                  <pic:nvPicPr>
+                    <pic:cNvPr id="0" name="09-produccion.png"/>
+                    <pic:cNvPicPr/>
+                  </pic:nvPicPr>
+                  <pic:blipFill>
+                    <a:blip r:embed="rId22"/>
+                    <a:stretch>
+                      <a:fillRect/>
+                    </a:stretch>
+                  </pic:blipFill>
+                  <pic:spPr>
+                    <a:xfrm>
+                      <a:off x="0" y="0"/>
+                      <a:ext cx="5303520" cy="3183665"/>
+                    </a:xfrm>
+                    <a:prstGeom prst="rect"/>
+                  </pic:spPr>
+                </pic:pic>
+              </a:graphicData>
+            </a:graphic>
+          </wp:inline>
+        </w:drawing>
+      </w:r>
+    </w:p>
+    <w:p>
+      <w:pPr>
+        <w:spacing w:before="120" w:line="23" w:lineRule="atLeast"/>
+        <w:ind w:left="709"/>
+        <w:rPr>
+          <w:rFonts w:ascii="Arial" w:hAnsi="Arial" w:cs="Arial"/>
+          <w:noProof/>
+          <w:sz w:val="22"/>
+          <w:szCs w:val="22"/>
+          <w:lang w:val="es-PE"/>
+        </w:rPr>
+      </w:pPr>
+      <w:r>
+        <w:rPr>
+          <w:rFonts w:ascii="Arial" w:hAnsi="Arial" w:cs="Arial"/>
+          <w:noProof/>
+          <w:sz w:val="22"/>
+          <w:szCs w:val="22"/>
+          <w:lang w:val="es-PE"/>
+        </w:rPr>
+        <w:t>Figura: Cola de producción y control de calidad.</w:t>
+      </w:r>
+    </w:p>
+    <w:p>
+      <w:pPr>
+        <w:jc w:val="center"/>
+      </w:pPr>
+      <w:r>
+        <w:drawing>
+          <wp:inline xmlns:a="http://schemas.openxmlformats.org/drawingml/2006/main" xmlns:pic="http://schemas.openxmlformats.org/drawingml/2006/picture">
+            <wp:extent cx="5303520" cy="3183665"/>
+            <wp:docPr id="75214850" name="Picture 75214850"/>
+            <wp:cNvGraphicFramePr>
+              <a:graphicFrameLocks noChangeAspect="1"/>
+            </wp:cNvGraphicFramePr>
+            <a:graphic>
+              <a:graphicData uri="http://schemas.openxmlformats.org/drawingml/2006/picture">
+                <pic:pic>
+                  <pic:nvPicPr>
+                    <pic:cNvPr id="0" name="11-inventario.png"/>
+                    <pic:cNvPicPr/>
+                  </pic:nvPicPr>
+                  <pic:blipFill>
+                    <a:blip r:embed="rId23"/>
+                    <a:stretch>
+                      <a:fillRect/>
+                    </a:stretch>
+                  </pic:blipFill>
+                  <pic:spPr>
+                    <a:xfrm>
+                      <a:off x="0" y="0"/>
+                      <a:ext cx="5303520" cy="3183665"/>
+                    </a:xfrm>
+                    <a:prstGeom prst="rect"/>
+                  </pic:spPr>
+                </pic:pic>
+              </a:graphicData>
+            </a:graphic>
+          </wp:inline>
+        </w:drawing>
+      </w:r>
+    </w:p>
+    <w:p>
+      <w:pPr>
+        <w:spacing w:before="120" w:line="23" w:lineRule="atLeast"/>
+        <w:ind w:left="709"/>
+        <w:rPr>
+          <w:rFonts w:ascii="Arial" w:hAnsi="Arial" w:cs="Arial"/>
+          <w:noProof/>
+          <w:sz w:val="22"/>
+          <w:szCs w:val="22"/>
+          <w:lang w:val="es-PE"/>
+        </w:rPr>
+      </w:pPr>
+      <w:r>
+        <w:rPr>
+          <w:rFonts w:ascii="Arial" w:hAnsi="Arial" w:cs="Arial"/>
+          <w:noProof/>
+          <w:sz w:val="22"/>
+          <w:szCs w:val="22"/>
+          <w:lang w:val="es-PE"/>
+        </w:rPr>
+        <w:t>Figura: Inventario con alerta de stock mínimo.</w:t>
+      </w:r>
+    </w:p>
+    <w:p>
+      <w:pPr>
+        <w:jc w:val="center"/>
+      </w:pPr>
+      <w:r>
+        <w:drawing>
+          <wp:inline xmlns:a="http://schemas.openxmlformats.org/drawingml/2006/main" xmlns:pic="http://schemas.openxmlformats.org/drawingml/2006/picture">
+            <wp:extent cx="5303520" cy="3183665"/>
+            <wp:docPr id="75214851" name="Picture 75214851"/>
+            <wp:cNvGraphicFramePr>
+              <a:graphicFrameLocks noChangeAspect="1"/>
+            </wp:cNvGraphicFramePr>
+            <a:graphic>
+              <a:graphicData uri="http://schemas.openxmlformats.org/drawingml/2006/picture">
+                <pic:pic>
+                  <pic:nvPicPr>
+                    <pic:cNvPr id="0" name="13-notificaciones-cliente.png"/>
+                    <pic:cNvPicPr/>
+                  </pic:nvPicPr>
+                  <pic:blipFill>
+                    <a:blip r:embed="rId24"/>
+                    <a:stretch>
+                      <a:fillRect/>
+                    </a:stretch>
+                  </pic:blipFill>
+                  <pic:spPr>
+                    <a:xfrm>
+                      <a:off x="0" y="0"/>
+                      <a:ext cx="5303520" cy="3183665"/>
+                    </a:xfrm>
+                    <a:prstGeom prst="rect"/>
+                  </pic:spPr>
+                </pic:pic>
+              </a:graphicData>
+            </a:graphic>
+          </wp:inline>
+        </w:drawing>
+      </w:r>
+    </w:p>
+    <w:p>
+      <w:pPr>
+        <w:spacing w:before="120" w:line="23" w:lineRule="atLeast"/>
+        <w:ind w:left="709"/>
+        <w:rPr>
+          <w:rFonts w:ascii="Arial" w:hAnsi="Arial" w:cs="Arial"/>
+          <w:noProof/>
+          <w:sz w:val="22"/>
+          <w:szCs w:val="22"/>
+          <w:lang w:val="es-PE"/>
+        </w:rPr>
+      </w:pPr>
+      <w:r>
+        <w:rPr>
+          <w:rFonts w:ascii="Arial" w:hAnsi="Arial" w:cs="Arial"/>
+          <w:noProof/>
+          <w:sz w:val="22"/>
+          <w:szCs w:val="22"/>
+          <w:lang w:val="es-PE"/>
+        </w:rPr>
+        <w:t>Figura: Notificaciones del cliente (eventos RabbitMQ).</w:t>
       </w:r>
     </w:p>
     <w:p>

</xml_diff>